<commit_message>
Knowledge - 5/19/2026 part 5
</commit_message>
<xml_diff>
--- a/Knowledge/3-Work knowledge/1-Software Engineering/4-Web Development/2-Frontend/2-Core Technologies/1-HTML/5-My Source/3-HTML Body Elements/2-HTML Heading Elements.docx
+++ b/Knowledge/3-Work knowledge/1-Software Engineering/4-Web Development/2-Frontend/2-Core Technologies/1-HTML/5-My Source/3-HTML Body Elements/2-HTML Heading Elements.docx
@@ -42,27 +42,7 @@
           <w:sz w:val="18"/>
           <w:highlight w:val="lightGray"/>
         </w:rPr>
-        <w:t xml:space="preserve">: Persons Table -&gt; ID Column: 1, </w:t>
-      </w:r>
-      <w:proofErr w:type="spellStart"/>
-      <w:r>
-        <w:rPr>
-          <w:rFonts w:ascii="Arial" w:hAnsi="Arial"/>
-          <w:color w:val="000000"/>
-          <w:sz w:val="18"/>
-          <w:highlight w:val="lightGray"/>
-        </w:rPr>
-        <w:t>Name_En</w:t>
-      </w:r>
-      <w:proofErr w:type="spellEnd"/>
-      <w:r>
-        <w:rPr>
-          <w:rFonts w:ascii="Arial" w:hAnsi="Arial"/>
-          <w:color w:val="000000"/>
-          <w:sz w:val="18"/>
-          <w:highlight w:val="lightGray"/>
-        </w:rPr>
-        <w:t xml:space="preserve"> Column: Motasem Essam] -&gt; </w:t>
+        <w:t xml:space="preserve">: Persons Table -&gt; ID Column: 1, Name_En Column: Motasem Essam] -&gt; </w:t>
       </w:r>
       <w:r>
         <w:rPr>
@@ -237,27 +217,7 @@
           <w:sz w:val="18"/>
           <w:highlight w:val="lightGray"/>
         </w:rPr>
-        <w:t xml:space="preserve">: Persons Table -&gt; ID Column: 1, </w:t>
-      </w:r>
-      <w:proofErr w:type="spellStart"/>
-      <w:r>
-        <w:rPr>
-          <w:rFonts w:ascii="Arial" w:hAnsi="Arial"/>
-          <w:color w:val="000000"/>
-          <w:sz w:val="18"/>
-          <w:highlight w:val="lightGray"/>
-        </w:rPr>
-        <w:t>Name_En</w:t>
-      </w:r>
-      <w:proofErr w:type="spellEnd"/>
-      <w:r>
-        <w:rPr>
-          <w:rFonts w:ascii="Arial" w:hAnsi="Arial"/>
-          <w:color w:val="000000"/>
-          <w:sz w:val="18"/>
-          <w:highlight w:val="lightGray"/>
-        </w:rPr>
-        <w:t xml:space="preserve"> Column: Motasem Essam] -&gt; </w:t>
+        <w:t xml:space="preserve">: Persons Table -&gt; ID Column: 1, Name_En Column: Motasem Essam] -&gt; </w:t>
       </w:r>
       <w:r>
         <w:rPr>
@@ -995,27 +955,7 @@
           <w:sz w:val="18"/>
           <w:highlight w:val="lightGray"/>
         </w:rPr>
-        <w:t xml:space="preserve">: Persons Table -&gt; ID Column: 1, </w:t>
-      </w:r>
-      <w:proofErr w:type="spellStart"/>
-      <w:r>
-        <w:rPr>
-          <w:rFonts w:ascii="Arial" w:hAnsi="Arial"/>
-          <w:color w:val="000000"/>
-          <w:sz w:val="18"/>
-          <w:highlight w:val="lightGray"/>
-        </w:rPr>
-        <w:t>Name_En</w:t>
-      </w:r>
-      <w:proofErr w:type="spellEnd"/>
-      <w:r>
-        <w:rPr>
-          <w:rFonts w:ascii="Arial" w:hAnsi="Arial"/>
-          <w:color w:val="000000"/>
-          <w:sz w:val="18"/>
-          <w:highlight w:val="lightGray"/>
-        </w:rPr>
-        <w:t xml:space="preserve"> Column: Motasem Essam] -&gt; </w:t>
+        <w:t xml:space="preserve">: Persons Table -&gt; ID Column: 1, Name_En Column: Motasem Essam] -&gt; </w:t>
       </w:r>
       <w:r>
         <w:rPr>
@@ -1275,7 +1215,6 @@
         </w:rPr>
         <w:t xml:space="preserve"># Source: </w:t>
       </w:r>
-      <w:proofErr w:type="spellStart"/>
       <w:r>
         <w:rPr>
           <w:rFonts w:ascii="Arial" w:eastAsia="Arial" w:hAnsi="Arial" w:cs="Arial"/>
@@ -1286,7 +1225,6 @@
         </w:rPr>
         <w:t>ScreenShot</w:t>
       </w:r>
-      <w:proofErr w:type="spellEnd"/>
       <w:r>
         <w:rPr>
           <w:rFonts w:ascii="Arial" w:hAnsi="Arial"/>
@@ -1327,25 +1265,7 @@
           <w:sz w:val="18"/>
           <w:highlight w:val="lightGray"/>
         </w:rPr>
-        <w:t xml:space="preserve"> [Persons Table -&gt; ID Column: 1, </w:t>
-      </w:r>
-      <w:proofErr w:type="spellStart"/>
-      <w:r>
-        <w:rPr>
-          <w:rFonts w:ascii="Arial" w:hAnsi="Arial"/>
-          <w:sz w:val="18"/>
-          <w:highlight w:val="lightGray"/>
-        </w:rPr>
-        <w:t>Name_En</w:t>
-      </w:r>
-      <w:proofErr w:type="spellEnd"/>
-      <w:r>
-        <w:rPr>
-          <w:rFonts w:ascii="Arial" w:hAnsi="Arial"/>
-          <w:sz w:val="18"/>
-          <w:highlight w:val="lightGray"/>
-        </w:rPr>
-        <w:t xml:space="preserve"> Column: Motasem Essam] -&gt; </w:t>
+        <w:t xml:space="preserve"> [Persons Table -&gt; ID Column: 1, Name_En Column: Motasem Essam] -&gt; </w:t>
       </w:r>
       <w:r>
         <w:rPr>
@@ -1362,25 +1282,7 @@
           <w:sz w:val="18"/>
           <w:highlight w:val="lightGray"/>
         </w:rPr>
-        <w:t xml:space="preserve"> [Automation Table -&gt; ID Column: 16, </w:t>
-      </w:r>
-      <w:proofErr w:type="spellStart"/>
-      <w:r>
-        <w:rPr>
-          <w:rFonts w:ascii="Arial" w:hAnsi="Arial"/>
-          <w:sz w:val="18"/>
-          <w:highlight w:val="lightGray"/>
-        </w:rPr>
-        <w:t>Name_En</w:t>
-      </w:r>
-      <w:proofErr w:type="spellEnd"/>
-      <w:r>
-        <w:rPr>
-          <w:rFonts w:ascii="Arial" w:hAnsi="Arial"/>
-          <w:sz w:val="18"/>
-          <w:highlight w:val="lightGray"/>
-        </w:rPr>
-        <w:t xml:space="preserve"> Column: Screen Capture] -&gt; </w:t>
+        <w:t xml:space="preserve"> [Automation Table -&gt; ID Column: 16, Name_En Column: Screen Capture] -&gt; </w:t>
       </w:r>
       <w:r>
         <w:rPr>
@@ -1622,10 +1524,10 @@
           <w:noProof/>
         </w:rPr>
         <w:drawing>
-          <wp:inline distT="0" distB="0" distL="0" distR="0" wp14:anchorId="17C50497" wp14:editId="520FD85E">
-            <wp:extent cx="5524500" cy="4099560"/>
+          <wp:inline distT="0" distB="0" distL="0" distR="0" wp14:anchorId="11FDA91A" wp14:editId="7EACD999">
+            <wp:extent cx="5943600" cy="3181350"/>
             <wp:effectExtent l="0" t="0" r="0" b="0"/>
-            <wp:docPr id="206646397" name="Picture 11"/>
+            <wp:docPr id="882593326" name="Picture 1"/>
             <wp:cNvGraphicFramePr>
               <a:graphicFrameLocks xmlns:a="http://schemas.openxmlformats.org/drawingml/2006/main" noChangeAspect="1"/>
             </wp:cNvGraphicFramePr>
@@ -1633,13 +1535,13 @@
               <a:graphicData uri="http://schemas.openxmlformats.org/drawingml/2006/picture">
                 <pic:pic xmlns:pic="http://schemas.openxmlformats.org/drawingml/2006/picture">
                   <pic:nvPicPr>
-                    <pic:cNvPr id="0" name="Picture 113"/>
+                    <pic:cNvPr id="0" name="Picture 7"/>
                     <pic:cNvPicPr>
                       <a:picLocks noChangeAspect="1" noChangeArrowheads="1"/>
                     </pic:cNvPicPr>
                   </pic:nvPicPr>
                   <pic:blipFill>
-                    <a:blip r:embed="rId11">
+                    <a:blip r:embed="rId11" cstate="print">
                       <a:extLst>
                         <a:ext uri="{28A0092B-C50C-407E-A947-70E740481C1C}">
                           <a14:useLocalDpi xmlns:a14="http://schemas.microsoft.com/office/drawing/2010/main" val="0"/>
@@ -1654,7 +1556,7 @@
                   <pic:spPr bwMode="auto">
                     <a:xfrm>
                       <a:off x="0" y="0"/>
-                      <a:ext cx="5524500" cy="4099560"/>
+                      <a:ext cx="5943600" cy="3181350"/>
                     </a:xfrm>
                     <a:prstGeom prst="rect">
                       <a:avLst/>
@@ -1718,27 +1620,7 @@
           <w:sz w:val="18"/>
           <w:highlight w:val="lightGray"/>
         </w:rPr>
-        <w:t xml:space="preserve">: Persons Table -&gt; ID Column: 1, </w:t>
-      </w:r>
-      <w:proofErr w:type="spellStart"/>
-      <w:r>
-        <w:rPr>
-          <w:rFonts w:ascii="Arial" w:hAnsi="Arial"/>
-          <w:color w:val="000000"/>
-          <w:sz w:val="18"/>
-          <w:highlight w:val="lightGray"/>
-        </w:rPr>
-        <w:t>Name_En</w:t>
-      </w:r>
-      <w:proofErr w:type="spellEnd"/>
-      <w:r>
-        <w:rPr>
-          <w:rFonts w:ascii="Arial" w:hAnsi="Arial"/>
-          <w:color w:val="000000"/>
-          <w:sz w:val="18"/>
-          <w:highlight w:val="lightGray"/>
-        </w:rPr>
-        <w:t xml:space="preserve"> Column: Motasem Essam] -&gt; </w:t>
+        <w:t xml:space="preserve">: Persons Table -&gt; ID Column: 1, Name_En Column: Motasem Essam] -&gt; </w:t>
       </w:r>
       <w:r>
         <w:rPr>
@@ -1912,7 +1794,6 @@
         <w:rPr>
           <w:rFonts w:ascii="Roboto Mono" w:hAnsi="Roboto Mono"/>
         </w:rPr>
-        <w:lastRenderedPageBreak/>
         <w:pict w14:anchorId="15CFD1E2">
           <v:rect id="_x0000_i1028" style="width:0;height:1.5pt" o:hralign="center" o:hrstd="t" o:hr="t" fillcolor="#a0a0a0" stroked="f"/>
         </w:pict>
@@ -1926,6 +1807,7 @@
         <w:rPr>
           <w:rFonts w:ascii="Segoe UI Emoji" w:hAnsi="Segoe UI Emoji" w:cs="Segoe UI Emoji"/>
         </w:rPr>
+        <w:lastRenderedPageBreak/>
         <w:t>🌐</w:t>
       </w:r>
       <w:r>
@@ -1950,27 +1832,7 @@
           <w:sz w:val="18"/>
           <w:highlight w:val="lightGray"/>
         </w:rPr>
-        <w:t xml:space="preserve">: Persons Table -&gt; ID Column: 1, </w:t>
-      </w:r>
-      <w:proofErr w:type="spellStart"/>
-      <w:r>
-        <w:rPr>
-          <w:rFonts w:ascii="Arial" w:hAnsi="Arial"/>
-          <w:color w:val="000000"/>
-          <w:sz w:val="18"/>
-          <w:highlight w:val="lightGray"/>
-        </w:rPr>
-        <w:t>Name_En</w:t>
-      </w:r>
-      <w:proofErr w:type="spellEnd"/>
-      <w:r>
-        <w:rPr>
-          <w:rFonts w:ascii="Arial" w:hAnsi="Arial"/>
-          <w:color w:val="000000"/>
-          <w:sz w:val="18"/>
-          <w:highlight w:val="lightGray"/>
-        </w:rPr>
-        <w:t xml:space="preserve"> Column: Motasem Essam] -&gt; </w:t>
+        <w:t xml:space="preserve">: Persons Table -&gt; ID Column: 1, Name_En Column: Motasem Essam] -&gt; </w:t>
       </w:r>
       <w:r>
         <w:rPr>
@@ -2193,27 +2055,7 @@
           <w:sz w:val="18"/>
           <w:highlight w:val="lightGray"/>
         </w:rPr>
-        <w:t xml:space="preserve">: Persons Table -&gt; ID Column: 1, </w:t>
-      </w:r>
-      <w:proofErr w:type="spellStart"/>
-      <w:r>
-        <w:rPr>
-          <w:rFonts w:ascii="Arial" w:hAnsi="Arial"/>
-          <w:color w:val="000000"/>
-          <w:sz w:val="18"/>
-          <w:highlight w:val="lightGray"/>
-        </w:rPr>
-        <w:t>Name_En</w:t>
-      </w:r>
-      <w:proofErr w:type="spellEnd"/>
-      <w:r>
-        <w:rPr>
-          <w:rFonts w:ascii="Arial" w:hAnsi="Arial"/>
-          <w:color w:val="000000"/>
-          <w:sz w:val="18"/>
-          <w:highlight w:val="lightGray"/>
-        </w:rPr>
-        <w:t xml:space="preserve"> Column: Motasem Essam] -&gt; </w:t>
+        <w:t xml:space="preserve">: Persons Table -&gt; ID Column: 1, Name_En Column: Motasem Essam] -&gt; </w:t>
       </w:r>
       <w:r>
         <w:rPr>
@@ -2654,27 +2496,7 @@
           <w:sz w:val="18"/>
           <w:highlight w:val="lightGray"/>
         </w:rPr>
-        <w:t xml:space="preserve">: Persons Table -&gt; ID Column: 1, </w:t>
-      </w:r>
-      <w:proofErr w:type="spellStart"/>
-      <w:r>
-        <w:rPr>
-          <w:rFonts w:ascii="Arial" w:hAnsi="Arial"/>
-          <w:color w:val="000000"/>
-          <w:sz w:val="18"/>
-          <w:highlight w:val="lightGray"/>
-        </w:rPr>
-        <w:t>Name_En</w:t>
-      </w:r>
-      <w:proofErr w:type="spellEnd"/>
-      <w:r>
-        <w:rPr>
-          <w:rFonts w:ascii="Arial" w:hAnsi="Arial"/>
-          <w:color w:val="000000"/>
-          <w:sz w:val="18"/>
-          <w:highlight w:val="lightGray"/>
-        </w:rPr>
-        <w:t xml:space="preserve"> Column: Motasem Essam] -&gt; </w:t>
+        <w:t xml:space="preserve">: Persons Table -&gt; ID Column: 1, Name_En Column: Motasem Essam] -&gt; </w:t>
       </w:r>
       <w:r>
         <w:rPr>

</xml_diff>